<commit_message>
Regenerate manuscript with panel fixes applied
Co-Authored-By: Claude Fable 5 <noreply@anthropic.com>
Claude-Session: https://claude.ai/code/session_01NnyH8bZ2fKPqNGQkoaqehQ
</commit_message>
<xml_diff>
--- a/cardinals-promise/manuscript/chapter-openers-manuscript.docx
+++ b/cardinals-promise/manuscript/chapter-openers-manuscript.docx
@@ -337,6 +337,16 @@
       </w:r>
     </w:p>
     <w:p>
+      <w:pPr>
+        <w:spacing w:line="480"/>
+        <w:ind w:firstLine="720"/>
+        <w:jc w:val="left"/>
+      </w:pPr>
+      <w:r>
+        <w:t xml:space="preserve">And whatever you think you should have seen coming before your moment — you couldn't have. We couldn't either. It's not your fault. That's why those words are on the cover.</w:t>
+      </w:r>
+    </w:p>
+    <w:p>
       <w:r>
         <w:br w:type="page"/>
       </w:r>
@@ -451,7 +461,7 @@
         <w:jc w:val="left"/>
       </w:pPr>
       <w:r>
-        <w:t xml:space="preserve">But here is the part I want you to hold on to. The fall didn't cause the problem. The fall </w:t>
+        <w:t xml:space="preserve">But hold on to this part. The fall didn't cause the problem. The fall </w:t>
       </w:r>
       <w:r>
         <w:rPr>
@@ -471,7 +481,7 @@
         <w:jc w:val="left"/>
       </w:pPr>
       <w:r>
-        <w:t xml:space="preserve">That is what this chapter is about. A fall is never just a fall. Weakness is never just getting older. They are information — and families who learn to read them find things early enough to make decisions instead of just reacting to them.</w:t>
+        <w:t xml:space="preserve">A fall is never just a fall. Weakness is never just getting older. They are information. Read them early enough, and you get to make decisions instead of reacting. And nobody catches everything — I didn't, and this is my profession. But once you know what a fall is trying to tell you, the next one becomes information instead of just fear.</w:t>
       </w:r>
     </w:p>
     <w:p>
@@ -626,7 +636,17 @@
         <w:jc w:val="left"/>
       </w:pPr>
       <w:r>
-        <w:t xml:space="preserve">There were other changes. She told stories from many years ago as if they had happened that morning. And there was a crudeness that was never her — my grandmother was a proper woman her whole life. The disease didn't just take her memory. It rewrote her manners.</w:t>
+        <w:t xml:space="preserve">I want to be careful here, because words like hers deserve care. When a person with dementia says something like that, you take it seriously. Every time. Ask the soft questions, the way I did. And look: for bruises nobody explains, for fear of one particular face, for a change with no story behind it. If the answers don't add up, call the administrator and the long-term-care ombudsman, and don't apologize for it. That day, every answer pointed to the therapy room. That is the only reason this story ends gently.</w:t>
+      </w:r>
+    </w:p>
+    <w:p>
+      <w:pPr>
+        <w:spacing w:line="480"/>
+        <w:ind w:firstLine="720"/>
+        <w:jc w:val="left"/>
+      </w:pPr>
+      <w:r>
+        <w:t xml:space="preserve">There were other changes. She told stories from many years ago as if they had happened that morning. And there was a crudeness that was never her — my grandmother was a proper woman her whole life. The disease took her memory. It took her manners too.</w:t>
       </w:r>
     </w:p>
     <w:p>
@@ -714,17 +734,17 @@
         <w:jc w:val="left"/>
       </w:pPr>
       <w:r>
-        <w:t xml:space="preserve">He had told my stepmom some things. He wanted to be buried; she knew a few of his wishes. But that was it — pieces of a plan, living in one person's memory. There was no meeting. There was no list. There was no talk of what a burial costs or where that money would come from.</w:t>
-      </w:r>
-    </w:p>
-    <w:p>
-      <w:pPr>
-        <w:spacing w:line="480"/>
-        <w:ind w:firstLine="720"/>
-        <w:jc w:val="left"/>
-      </w:pPr>
-      <w:r>
-        <w:t xml:space="preserve">We didn't avoid it out of carelessness. We avoided it out of love — the kind that doesn't want to say the hard thing out loud, as if the conversation itself could bring the day closer. That is the lie almost every family tells itself. The conversation does not bring the day closer. It only decides whether you will be ready when the day comes on its own.</w:t>
+        <w:t xml:space="preserve">He had told my stepmom some things. He wanted to be buried; she knew a few of his wishes. But that was it — pieces of a plan, living in one person's memory. There was no meeting. There was no list. And none of us asked the money question. Not one of us. Not even me, and I do this for a living.</w:t>
+      </w:r>
+    </w:p>
+    <w:p>
+      <w:pPr>
+        <w:spacing w:line="480"/>
+        <w:ind w:firstLine="720"/>
+        <w:jc w:val="left"/>
+      </w:pPr>
+      <w:r>
+        <w:t xml:space="preserve">We didn't avoid it out of carelessness. We avoided it out of love — the kind that doesn't want to say the hard thing out loud, as if the conversation itself could bring the day closer. It doesn't. The conversation only decides whether you will be ready when the day comes on its own.</w:t>
       </w:r>
     </w:p>
     <w:p>
@@ -782,7 +802,7 @@
         <w:jc w:val="left"/>
       </w:pPr>
       <w:r>
-        <w:t xml:space="preserve">Families walk into a memory care unit braced for the locked doors. Let me tell you what I found behind them.</w:t>
+        <w:t xml:space="preserve">Let me tell you what I found behind the locked doors of a memory care unit.</w:t>
       </w:r>
     </w:p>
     <w:p>
@@ -872,7 +892,7 @@
         <w:jc w:val="left"/>
       </w:pPr>
       <w:r>
-        <w:t xml:space="preserve">Some people hear that and call it a trick. It is not a trick. It is meeting a person inside their reality instead of dragging them out of it. Nobody was corrected. Nobody was restrained. Nobody lost an argument about where home is. My Nana taught me you will never win an argument with dementia. That painted station is what winning looks like instead.</w:t>
+        <w:t xml:space="preserve">Some people call that a trick. It isn't. It is meeting a person inside her reality instead of dragging her out of it. Nobody was corrected. Nobody was restrained. Nobody lost an argument about where home is. My Nana taught me you will never win an argument with dementia. That painted station is what winning looks like instead.</w:t>
       </w:r>
     </w:p>
     <w:p>
@@ -892,7 +912,7 @@
         <w:jc w:val="left"/>
       </w:pPr>
       <w:r>
-        <w:t xml:space="preserve">This is what this chapter is about: what memory care actually is, how to know a good unit from a warehouse, and what to look for when you tour one. Hint — look at the walls.</w:t>
+        <w:t xml:space="preserve">When you tour a unit, look at the walls.</w:t>
       </w:r>
     </w:p>
     <w:p>
@@ -940,7 +960,7 @@
         <w:jc w:val="left"/>
       </w:pPr>
       <w:r>
-        <w:t xml:space="preserve">Marion and Frank are family friends. Frank fell and broke his hip, and he was admitted to Gulf Breeze Hospital. His daughter stepped in as his primary caregiver — and the family called me with one question: </w:t>
+        <w:t xml:space="preserve">Marion and Frank are family friends. Frank fell and broke his hip, and he was admitted to the local hospital. His daughter stepped in as his primary caregiver — and the family called me with one question: </w:t>
       </w:r>
       <w:r>
         <w:rPr>
@@ -967,37 +987,37 @@
         <w:jc w:val="left"/>
       </w:pPr>
       <w:r>
-        <w:t xml:space="preserve">Here is what I carried into that call that they didn't: a broken hip after seventy-five is one of the hardest recoveries in all of elder care. A significant number of people who go into rehab for a hip never make it back to the life they had before. Many will need a higher level of care when rehab ends.</w:t>
-      </w:r>
-    </w:p>
-    <w:p>
-      <w:pPr>
-        <w:spacing w:line="480"/>
-        <w:ind w:firstLine="720"/>
-        <w:jc w:val="left"/>
-      </w:pPr>
-      <w:r>
-        <w:t xml:space="preserve">I didn't lead with that. Because here is the other thing I know, just as true: recovery varies person to person, and nobody's outcome is written in advance. You give rehab everything — full effort, full attention, full fight — before you ever assume the next level of care is coming.</w:t>
-      </w:r>
-    </w:p>
-    <w:p>
-      <w:pPr>
-        <w:spacing w:line="480"/>
-        <w:ind w:firstLine="720"/>
-        <w:jc w:val="left"/>
-      </w:pPr>
-      <w:r>
-        <w:t xml:space="preserve">So that's what I told them, and it's what I'm telling you. Hold both. Cheer the recovery like it's going to work, and quietly start learning what comes next in case it doesn't. That is not pessimism. That is what showing up prepared looks like — and it's the hardest skill in this entire book.</w:t>
-      </w:r>
-    </w:p>
-    <w:p>
-      <w:pPr>
-        <w:spacing w:line="480"/>
-        <w:ind w:firstLine="720"/>
-        <w:jc w:val="left"/>
-      </w:pPr>
-      <w:r>
-        <w:t xml:space="preserve">Frank is fighting. I check in on the family, and this chapter is everything I want them — and you — to know while he does.</w:t>
+        <w:t xml:space="preserve">Here is what I carried into that call that they didn't — the thing every rehab team I ever worked alongside knew: a broken hip after seventy-five is one of the hardest recoveries in all of elder care. A significant number of people who go into rehab for a hip never make it back to the life they had before. Many will need a higher level of care when rehab ends.</w:t>
+      </w:r>
+    </w:p>
+    <w:p>
+      <w:pPr>
+        <w:spacing w:line="480"/>
+        <w:ind w:firstLine="720"/>
+        <w:jc w:val="left"/>
+      </w:pPr>
+      <w:r>
+        <w:t xml:space="preserve">I didn't lead with that. Because here is the other thing I know, just as true: recovery varies person to person, and nobody's outcome is written in advance. You give rehab everything you have before you ever assume the next level of care is coming.</w:t>
+      </w:r>
+    </w:p>
+    <w:p>
+      <w:pPr>
+        <w:spacing w:line="480"/>
+        <w:ind w:firstLine="720"/>
+        <w:jc w:val="left"/>
+      </w:pPr>
+      <w:r>
+        <w:t xml:space="preserve">So that's what I told them, and it's what I'm telling you. Hold both. Cheer the recovery like it's going to work, and quietly start learning what comes next in case it doesn't. That is not pessimism. That is showing up prepared.</w:t>
+      </w:r>
+    </w:p>
+    <w:p>
+      <w:pPr>
+        <w:spacing w:line="480"/>
+        <w:ind w:firstLine="720"/>
+        <w:jc w:val="left"/>
+      </w:pPr>
+      <w:r>
+        <w:t xml:space="preserve">Frank is fighting, and I check in on the family. But you may not have a friend in the industry to call. This chapter is that phone call.</w:t>
       </w:r>
     </w:p>
     <w:p>
@@ -1045,47 +1065,27 @@
         <w:jc w:val="left"/>
       </w:pPr>
       <w:r>
-        <w:t xml:space="preserve">People ask me when hospice stopped being a job and became a calling. The honest answer is that it was never just a job. The calling came early — before I ever lost someone of my own.</w:t>
-      </w:r>
-    </w:p>
-    <w:p>
-      <w:pPr>
-        <w:spacing w:line="480"/>
-        <w:ind w:firstLine="720"/>
-        <w:jc w:val="left"/>
-      </w:pPr>
-      <w:r>
-        <w:t xml:space="preserve">I got sober on January 9, 2009. Part of staying sober is helping other people get sober. And part of sponsoring people is losing some of them.</w:t>
-      </w:r>
-    </w:p>
-    <w:p>
-      <w:pPr>
-        <w:spacing w:line="480"/>
-        <w:ind w:firstLine="720"/>
-        <w:jc w:val="left"/>
-      </w:pPr>
-      <w:r>
-        <w:t xml:space="preserve">They were young. People with most of their life still owed to them. I sat with their families afterward, and there is no clean word for what that was. Nobody is prepared to bury someone in their twenties.</w:t>
-      </w:r>
-    </w:p>
-    <w:p>
-      <w:pPr>
-        <w:spacing w:line="480"/>
-        <w:ind w:firstLine="720"/>
-        <w:jc w:val="left"/>
-      </w:pPr>
-      <w:r>
-        <w:t xml:space="preserve">That is where I learned to sit with people in pain and not run. And it is why, when I found hospice, I saw it differently than most people do.</w:t>
-      </w:r>
-    </w:p>
-    <w:p>
-      <w:pPr>
-        <w:spacing w:line="480"/>
-        <w:ind w:firstLine="720"/>
-        <w:jc w:val="left"/>
-      </w:pPr>
-      <w:r>
-        <w:t xml:space="preserve">The young deaths showed me what a robbed life looks like. A hospice patient's life is not that. Most have lived full lives — work, marriages, grandchildren around a table. Hospice takes nothing from them. It gives: comfort instead of pain. Dignity instead of machines. Presence instead of fear. When I tell a family that choosing hospice is a gift, I am not softening anything. I have seen the alternative, and it is not a longer life. It is a harder death.</w:t>
+        <w:t xml:space="preserve">Hospice is the word families fear most in this book. So I want to tell you how I came to love it.</w:t>
+      </w:r>
+    </w:p>
+    <w:p>
+      <w:pPr>
+        <w:spacing w:line="480"/>
+        <w:ind w:firstLine="720"/>
+        <w:jc w:val="left"/>
+      </w:pPr>
+      <w:r>
+        <w:t xml:space="preserve">I got sober on January 9, 2009, and part of staying sober is helping other people get sober. Some of the people I sponsored didn't make it. They were young — most of their life still owed to them — and sitting with their families afterward is where I learned what a robbed life looks like, and how to stay in a room full of pain without running.</w:t>
+      </w:r>
+    </w:p>
+    <w:p>
+      <w:pPr>
+        <w:spacing w:line="480"/>
+        <w:ind w:firstLine="720"/>
+        <w:jc w:val="left"/>
+      </w:pPr>
+      <w:r>
+        <w:t xml:space="preserve">A hospice patient's life is not a robbed life. Most have lived full ones — work, marriages, grandchildren around a table. And when they haven't, hospice holds those families closest of all. Hospice takes nothing from anyone. It gives. Comfort instead of pain. Somebody in the room instead of machines. When I tell a family that choosing hospice is a gift, I am not softening anything. I have seen the alternative, and it is not a longer life. It is a harder death.</w:t>
       </w:r>
     </w:p>
     <w:p>
@@ -1105,37 +1105,17 @@
         <w:jc w:val="left"/>
       </w:pPr>
       <w:r>
-        <w:t xml:space="preserve">His wife is a nurse, and at the end, his comfort was real — a morphine drip, managed with skill and love. He did not suffer his way out of this world. That is what hospice care is supposed to look like, and my own father received it.</w:t>
-      </w:r>
-    </w:p>
-    <w:p>
-      <w:pPr>
-        <w:spacing w:line="480"/>
-        <w:ind w:firstLine="720"/>
-        <w:jc w:val="left"/>
-      </w:pPr>
-      <w:r>
-        <w:t xml:space="preserve">Something changed in me after that. Not the calling — that was already there. What changed is that now, when I sit with a family, I am not speaking from training. I have lived the same pain they are living. I know that at the end, many of the decisions fall to the family, because the patient often no longer can make them — and I know exactly how heavy that is, because I have carried it.</w:t>
-      </w:r>
-    </w:p>
-    <w:p>
-      <w:pPr>
-        <w:spacing w:line="480"/>
-        <w:ind w:firstLine="720"/>
-        <w:jc w:val="left"/>
-      </w:pPr>
-      <w:r>
-        <w:t xml:space="preserve">People sometimes measure this work in numbers — patients served, families reached. That has never been what drives me. What drives me is what hospice gives the </w:t>
-      </w:r>
-      <w:r>
-        <w:rPr>
-          <w:i/>
-          <w:iCs/>
-        </w:rPr>
-        <w:t xml:space="preserve">whole</w:t>
-      </w:r>
-      <w:r>
-        <w:t xml:space="preserve"> family: the pain managed, the fear named, the room made peaceful enough for love to do its work.</w:t>
+        <w:t xml:space="preserve">At the end, his comfort was real. He did not suffer his way out of this world. And I want to say something plainly, because I know how end-of-life comfort care gets read: the morphine does not bring the morning closer. It is started because the morning has come. Given right — the right dose, for the pain that is actually there — it takes nothing but the suffering. And that comfort wasn't luck, and it wasn't inside knowledge. It is what a hospice team brings into every home. Including yours.</w:t>
+      </w:r>
+    </w:p>
+    <w:p>
+      <w:pPr>
+        <w:spacing w:line="480"/>
+        <w:ind w:firstLine="720"/>
+        <w:jc w:val="left"/>
+      </w:pPr>
+      <w:r>
+        <w:t xml:space="preserve">Now when I sit with a family, I am not speaking from training. I have lived the same pain they are living — including the weight of the decisions that fall to the family at the end, when the patient no longer can make them.</w:t>
       </w:r>
     </w:p>
     <w:p>
@@ -1152,17 +1132,7 @@
           <w:i/>
           <w:iCs/>
         </w:rPr>
-        <w:t xml:space="preserve">I will not let you be in pain. I will not let you die alone. I will show up every day until the last one.</w:t>
-      </w:r>
-    </w:p>
-    <w:p>
-      <w:pPr>
-        <w:spacing w:line="480"/>
-        <w:ind w:firstLine="720"/>
-        <w:jc w:val="left"/>
-      </w:pPr>
-      <w:r>
-        <w:t xml:space="preserve">This chapter shows you how to accept that gift.</w:t>
+        <w:t xml:space="preserve">I will not let you be in pain. I will not let you be alone in this. I am a phone call away every hour of every day and night, and I will keep showing up until the last day.</w:t>
       </w:r>
     </w:p>
     <w:p>
@@ -1230,7 +1200,7 @@
         <w:jc w:val="left"/>
       </w:pPr>
       <w:r>
-        <w:t xml:space="preserve">Everyone is wrong. Prescription assistance is based on </w:t>
+        <w:t xml:space="preserve">Everyone is wrong. Prescription assistance from drug makers and charities is based on </w:t>
       </w:r>
       <w:r>
         <w:rPr>
@@ -1250,7 +1220,7 @@
         <w:jc w:val="left"/>
       </w:pPr>
       <w:r>
-        <w:t xml:space="preserve">So here is the rule, and it applies to almost every program in this part of the book: </w:t>
+        <w:t xml:space="preserve">So here is the rule: </w:t>
       </w:r>
       <w:r>
         <w:rPr>
@@ -1260,17 +1230,27 @@
         <w:t xml:space="preserve">always fill out the paperwork.</w:t>
       </w:r>
       <w:r>
-        <w:t xml:space="preserve"> Do not decide for the program whether you qualify. Do not let the house, the boat, or your pride answer a question the application never asks. The application asks what comes in each month. Answer that, send it in, and let them say no.</w:t>
-      </w:r>
-    </w:p>
-    <w:p>
-      <w:pPr>
-        <w:spacing w:line="480"/>
-        <w:ind w:firstLine="720"/>
-        <w:jc w:val="left"/>
-      </w:pPr>
-      <w:r>
-        <w:t xml:space="preserve">Most families never apply. The money goes unclaimed — millions of dollars of it, every year, left on tables by people who assumed. This chapter is about not being one of them.</w:t>
+        <w:t xml:space="preserve"> Do not decide for the program whether you qualify. Do not let the house, the boat, or your pride answer a question the application never asks. Answer what it asks, send it in, and let them say no.</w:t>
+      </w:r>
+    </w:p>
+    <w:p>
+      <w:pPr>
+        <w:spacing w:line="480"/>
+        <w:ind w:firstLine="720"/>
+        <w:jc w:val="left"/>
+      </w:pPr>
+      <w:r>
+        <w:t xml:space="preserve">One warning before you run with that rule: some programs later in this book do ask about savings. Medicaid asks hardest — for that one, get a guide before you file. But never do a program's math for it.</w:t>
+      </w:r>
+    </w:p>
+    <w:p>
+      <w:pPr>
+        <w:spacing w:line="480"/>
+        <w:ind w:firstLine="720"/>
+        <w:jc w:val="left"/>
+      </w:pPr>
+      <w:r>
+        <w:t xml:space="preserve">Most families never apply. The money goes unclaimed, year after year, left on tables by people who assumed.</w:t>
       </w:r>
     </w:p>
     <w:p>
@@ -1348,57 +1328,37 @@
         <w:jc w:val="left"/>
       </w:pPr>
       <w:r>
-        <w:t xml:space="preserve">For narcotics, there's a safety net: prescription monitoring programs flag the overlap. For almost everything else — including drugs where a double dose can put someone in the hospital — the net is you.</w:t>
-      </w:r>
-    </w:p>
-    <w:p>
-      <w:pPr>
-        <w:spacing w:line="480"/>
-        <w:ind w:firstLine="720"/>
-        <w:jc w:val="left"/>
-      </w:pPr>
-      <w:r>
-        <w:t xml:space="preserve">That is what the Important Documents Folder is. It is the net.</w:t>
-      </w:r>
-    </w:p>
-    <w:p>
-      <w:pPr>
-        <w:spacing w:line="480"/>
-        <w:ind w:firstLine="720"/>
-        <w:jc w:val="left"/>
-      </w:pPr>
-      <w:r>
-        <w:t xml:space="preserve">One folder, one master list, shared by every family member involved in the care: the insurance and Medicare cards, the Social Security card, the VA card if there is one. The doctors and how to reach them. Every diagnosis. And the medication list — kept current, updated the day anything changes, with two things most families never write down: </w:t>
-      </w:r>
-      <w:r>
-        <w:rPr>
-          <w:i/>
-          <w:iCs/>
-        </w:rPr>
-        <w:t xml:space="preserve">which doctor prescribes each medication</w:t>
-      </w:r>
-      <w:r>
-        <w:t xml:space="preserve">, and </w:t>
-      </w:r>
-      <w:r>
-        <w:rPr>
-          <w:i/>
-          <w:iCs/>
-        </w:rPr>
-        <w:t xml:space="preserve">both its brand and generic names, side by side</w:t>
-      </w:r>
-      <w:r>
-        <w:t xml:space="preserve">.</w:t>
-      </w:r>
-    </w:p>
-    <w:p>
-      <w:pPr>
-        <w:spacing w:line="480"/>
-        <w:ind w:firstLine="720"/>
-        <w:jc w:val="left"/>
-      </w:pPr>
-      <w:r>
-        <w:t xml:space="preserve">Doctors in different systems don't communicate. That sentence should be printed on the front of the folder, because it is the reason the folder exists. You are the only one who sees the whole picture. This chapter makes sure the whole picture is on paper.</w:t>
+        <w:t xml:space="preserve">For painkillers and a handful of other controlled drugs, there is a partial safety net: state monitoring programs a pharmacist or doctor can check. For everything else, there are exactly two nets. The first is simple, and I am begging you to use it — fill every prescription at one pharmacy, so one computer sees every bottle. The second net is you.</w:t>
+      </w:r>
+    </w:p>
+    <w:p>
+      <w:pPr>
+        <w:spacing w:line="480"/>
+        <w:ind w:firstLine="720"/>
+        <w:jc w:val="left"/>
+      </w:pPr>
+      <w:r>
+        <w:t xml:space="preserve">That is what the Important Documents Folder is. The net, on paper.</w:t>
+      </w:r>
+    </w:p>
+    <w:p>
+      <w:pPr>
+        <w:spacing w:line="480"/>
+        <w:ind w:firstLine="720"/>
+        <w:jc w:val="left"/>
+      </w:pPr>
+      <w:r>
+        <w:t xml:space="preserve">One folder. One master list. Every family member involved in the care has it: the cards, the doctors, every diagnosis, and the medication list — updated the day anything changes, with which doctor prescribes each drug, and brand and generic names side by side. The full checklist is in this chapter.</w:t>
+      </w:r>
+    </w:p>
+    <w:p>
+      <w:pPr>
+        <w:spacing w:line="480"/>
+        <w:ind w:firstLine="720"/>
+        <w:jc w:val="left"/>
+      </w:pPr>
+      <w:r>
+        <w:t xml:space="preserve">You cannot count on doctors in different systems to communicate. That sentence should be printed on the front of the folder, because it is the reason the folder exists. You are the only one who sees the whole picture. This chapter puts the whole picture on paper.</w:t>
       </w:r>
     </w:p>
     <w:p>
@@ -1466,47 +1426,57 @@
         <w:jc w:val="left"/>
       </w:pPr>
       <w:r>
-        <w:t xml:space="preserve">A friend of mine learned this with their own mother. Her dementia had been progressing for a while — and when the family finally reached for the paperwork, the window had closed. A person has to be legally capable of understanding what they are signing. She no longer was. Which meant she could no longer grant anyone the authority to speak for her — not even her own child.</w:t>
-      </w:r>
-    </w:p>
-    <w:p>
-      <w:pPr>
-        <w:spacing w:line="480"/>
-        <w:ind w:firstLine="720"/>
-        <w:jc w:val="left"/>
-      </w:pPr>
-      <w:r>
-        <w:t xml:space="preserve">So my friend was excluded from their mother's healthcare decisions. Not because the family didn't love her. Not because they didn't know her wishes. Because of a signature that never happened while it still could.</w:t>
-      </w:r>
-    </w:p>
-    <w:p>
-      <w:pPr>
-        <w:spacing w:line="480"/>
-        <w:ind w:firstLine="720"/>
-        <w:jc w:val="left"/>
-      </w:pPr>
-      <w:r>
-        <w:t xml:space="preserve">There were workarounds. There usually are — hoops, petitions, delays, and doors that a single signed page would have opened instantly. They got through some of it. But everything was harder, slower, and colder than it ever needed to be.</w:t>
-      </w:r>
-    </w:p>
-    <w:p>
-      <w:pPr>
-        <w:spacing w:line="480"/>
-        <w:ind w:firstLine="720"/>
-        <w:jc w:val="left"/>
-      </w:pPr>
-      <w:r>
-        <w:t xml:space="preserve">Here is the part I need you to sit with: dementia does not announce the last day your parent can still legally sign their name. That day arrives quietly, looks like every other day, and passes. You only find out it's gone when you need the signature.</w:t>
-      </w:r>
-    </w:p>
-    <w:p>
-      <w:pPr>
-        <w:spacing w:line="480"/>
-        <w:ind w:firstLine="720"/>
-        <w:jc w:val="left"/>
-      </w:pPr>
-      <w:r>
-        <w:t xml:space="preserve">So this chapter's advice is the simplest in the book, and the most urgent. Get the healthcare power of attorney done now — while "now" is still available — and put it in the folder from Chapter 19. Today is early. Early is the only time this document can be signed.</w:t>
+        <w:t xml:space="preserve">A friend of mine learned this with their own mother. Her dementia had been progressing for a while — and when the family finally reached for the paperwork, the window had closed. A person has to be capable of understanding what they are signing, and she no longer was. She could not put her own choice on paper anymore. She could not name which of her children spoke for her, or make sure the hospital would listen to the right one without a fight.</w:t>
+      </w:r>
+    </w:p>
+    <w:p>
+      <w:pPr>
+        <w:spacing w:line="480"/>
+        <w:ind w:firstLine="720"/>
+        <w:jc w:val="left"/>
+      </w:pPr>
+      <w:r>
+        <w:t xml:space="preserve">Most states will let family step in eventually, even without the paperwork. What my friend lost was the eventually. Every decision came with delays, disagreements, and doors that a single signed page would have opened instantly. Everything was harder, slower, and colder than it ever needed to be.</w:t>
+      </w:r>
+    </w:p>
+    <w:p>
+      <w:pPr>
+        <w:spacing w:line="480"/>
+        <w:ind w:firstLine="720"/>
+        <w:jc w:val="left"/>
+      </w:pPr>
+      <w:r>
+        <w:t xml:space="preserve">Here is the part I need you to sit with: dementia does not announce the last day your parent can still legally sign. That day arrives quietly, looks like every other day, and passes.</w:t>
+      </w:r>
+    </w:p>
+    <w:p>
+      <w:pPr>
+        <w:spacing w:line="480"/>
+        <w:ind w:firstLine="720"/>
+        <w:jc w:val="left"/>
+      </w:pPr>
+      <w:r>
+        <w:t xml:space="preserve">And here is the other half, because you may be reading this with a diagnosis already in the family: a diagnosis is not the closed window. Many people in early dementia can still legally sign — the question is whether they understand what the document does, and an elder-law attorney can tell you in one visit. Go this week.</w:t>
+      </w:r>
+    </w:p>
+    <w:p>
+      <w:pPr>
+        <w:spacing w:line="480"/>
+        <w:ind w:firstLine="720"/>
+        <w:jc w:val="left"/>
+      </w:pPr>
+      <w:r>
+        <w:t xml:space="preserve">And if the window truly has closed in your family, keep reading. There is still a path — this chapter covers it — and missing a window nobody showed you is not the same as failing.</w:t>
+      </w:r>
+    </w:p>
+    <w:p>
+      <w:pPr>
+        <w:spacing w:line="480"/>
+        <w:ind w:firstLine="720"/>
+        <w:jc w:val="left"/>
+      </w:pPr>
+      <w:r>
+        <w:t xml:space="preserve">Get the healthcare power of attorney done now, and put it in the folder from Chapter 19.</w:t>
       </w:r>
     </w:p>
     <w:p>
@@ -1591,7 +1561,7 @@
         <w:jc w:val="left"/>
       </w:pPr>
       <w:r>
-        <w:t xml:space="preserve">Spouse versus children is the most common version, and it is the cruelest, because it sets the two halves of a family against each other at the exact moment they need each other most. A living will ends that fight before it starts. It replaces guessing with knowing. The question stops being </w:t>
+        <w:t xml:space="preserve">Spouse versus children is the most common version, and it is the cruelest, because it sets the two halves of a family against each other at the exact moment they need each other most. A living will ends most of that fight before it starts. The question stops being </w:t>
       </w:r>
       <w:r>
         <w:rPr>
@@ -1631,7 +1601,7 @@
         <w:jc w:val="left"/>
       </w:pPr>
       <w:r>
-        <w:t xml:space="preserve">And one more thing, because it matters just as much as the writing: the document has to be </w:t>
+        <w:t xml:space="preserve">And it has to be </w:t>
       </w:r>
       <w:r>
         <w:rPr>
@@ -1641,7 +1611,7 @@
         <w:t xml:space="preserve">findable</w:t>
       </w:r>
       <w:r>
-        <w:t xml:space="preserve">. A DNR that exists in a drawer nobody can locate does not exist. If the paper cannot be produced, the default is full intervention — everything done, including the things your person said they never wanted. We'll cover where these orders must physically live in Chapter 23. For now: write it down, and make sure the right people can put their hands on it in under a minute.</w:t>
+        <w:t xml:space="preserve">. A DNR that exists in a drawer nobody can locate does not exist — if the paper cannot be produced, the default is full intervention, including the things your person said they never wanted. Chapter 23 covers where these orders must physically live. For now: write it down, and make sure the right people can put their hands on it in under a minute.</w:t>
       </w:r>
     </w:p>
     <w:p>
@@ -1699,7 +1669,7 @@
         <w:jc w:val="left"/>
       </w:pPr>
       <w:r>
-        <w:t xml:space="preserve">The rent at the assisted living community. The insurance premium that keeps coverage alive. The bills that keep the lights on in a house nobody's living in right now. Without a financial power of attorney — or with the wrong person named — the family can't act, and the state steps in. Courts, guardianship proceedings, oversight. Strangers, added to your family's worst month. And while all of that grinds forward, the payments wait, the coverage waits, the placement waits. The person at the center of it all waits.</w:t>
+        <w:t xml:space="preserve">The rent at the assisted living community. The insurance premium that keeps coverage alive. The bills that keep the lights on in a house nobody's living in right now. Without a financial power of attorney — or with the wrong person named — the family can't act, and a court and a judge step in. Guardianship proceedings, oversight, months of it. The court usually ends up appointing a family member anyway — after the delay, the cost, and the strangers added to your family's worst month. And while all of that grinds forward, everything waits. So does the person it's all for.</w:t>
       </w:r>
     </w:p>
     <w:p>
@@ -1719,17 +1689,17 @@
         <w:jc w:val="left"/>
       </w:pPr>
       <w:r>
-        <w:t xml:space="preserve">So here is what I want you to do, and I mean this as literally as anything in this book. Get all three documents done together — the living will, the healthcare power of attorney, the financial power of attorney. One effort, one afternoon if you can manage it.</w:t>
-      </w:r>
-    </w:p>
-    <w:p>
-      <w:pPr>
-        <w:spacing w:line="480"/>
-        <w:ind w:firstLine="720"/>
-        <w:jc w:val="left"/>
-      </w:pPr>
-      <w:r>
-        <w:t xml:space="preserve">And while the notary is right there: </w:t>
+        <w:t xml:space="preserve">So here is what I want you to do. Get all three documents done together — the living will, the healthcare power of attorney, the financial power of attorney. One effort, one afternoon if you can manage it. Do it with someone who knows your state's rules, because signing requirements vary — witnesses, notaries, and who is allowed to be which.</w:t>
+      </w:r>
+    </w:p>
+    <w:p>
+      <w:pPr>
+        <w:spacing w:line="480"/>
+        <w:ind w:firstLine="720"/>
+        <w:jc w:val="left"/>
+      </w:pPr>
+      <w:r>
+        <w:t xml:space="preserve">And while you're at that table: </w:t>
       </w:r>
       <w:r>
         <w:rPr>
@@ -1746,7 +1716,7 @@
         <w:jc w:val="left"/>
       </w:pPr>
       <w:r>
-        <w:t xml:space="preserve">You are reading this book because your parent's crisis landed on you unprepared. Someday, your crisis will land on someone you love. The three documents you are gathering for your mother are the same three your children will need from you. Do them at the same table, on the same day. It is the most loving paperwork you will ever complete.</w:t>
+        <w:t xml:space="preserve">You are reading this book because your parent's crisis landed on you unprepared. Someday, your crisis will land on someone you love. The three documents you are gathering for your mother are the same three your children will need from you. Do them at the same table, on the same day. It is love, in paperwork form.</w:t>
       </w:r>
     </w:p>
     <w:p>
@@ -1794,17 +1764,7 @@
         <w:jc w:val="left"/>
       </w:pPr>
       <w:r>
-        <w:t xml:space="preserve">Just last week, I sat with a family and helped them have the conversation — the one about what's coming, what he wants, what needs saying while there's still time to say it. I do this all the time. It is the core message of my first book, </w:t>
-      </w:r>
-      <w:r>
-        <w:rPr>
-          <w:i/>
-          <w:iCs/>
-        </w:rPr>
-        <w:t xml:space="preserve">The Cardinal's Promise</w:t>
-      </w:r>
-      <w:r>
-        <w:t xml:space="preserve">: don't leave anything left unsaid.</w:t>
+        <w:t xml:space="preserve">Just last week, I sat with a family and helped them have the conversation — the one about what's coming, what he wants, what needs saying while there's still time to say it. I have that conversation with other families all the time. Don't leave anything left unsaid.</w:t>
       </w:r>
     </w:p>
     <w:p>
@@ -1824,7 +1784,7 @@
         <w:jc w:val="left"/>
       </w:pPr>
       <w:r>
-        <w:t xml:space="preserve">I never forced the planning conversations. I knew better — it is literally my work — and I still let them slide, the way every family does. There was always going to be more time. So the decisions he should have made stayed unmade, and they came due the week of his funeral. Financial matters surfacing at the worst possible time, pulling us away from the one thing that week was for: grieving him.</w:t>
+        <w:t xml:space="preserve">I never forced the planning conversations. I knew better — it is literally my work — and I still let them slide, the way every family does. There was always going to be more time. So the decisions he should have made stayed unmade, and they came due the week of his funeral. Money questions, surfacing in the worst week to face them.</w:t>
       </w:r>
     </w:p>
     <w:p>
@@ -1844,67 +1804,27 @@
         <w:jc w:val="left"/>
       </w:pPr>
       <w:r>
-        <w:t xml:space="preserve">But there is a second kind of unsaid — and that kind, I finished.</w:t>
-      </w:r>
-    </w:p>
-    <w:p>
-      <w:pPr>
-        <w:spacing w:line="480"/>
-        <w:ind w:firstLine="720"/>
-        <w:jc w:val="left"/>
-      </w:pPr>
-      <w:r>
-        <w:t xml:space="preserve">I was not in the room when my dad died. I thought we had a few more days. He didn't have them. And I have struggled with not being there — I still do.</w:t>
-      </w:r>
-    </w:p>
-    <w:p>
-      <w:pPr>
-        <w:spacing w:line="480"/>
-        <w:ind w:firstLine="720"/>
-        <w:jc w:val="left"/>
-      </w:pPr>
-      <w:r>
-        <w:t xml:space="preserve">Two things give me peace. The first: I had said everything that needed to be said. Everything. There was nothing my father didn't know — no forgiveness withheld, no love left in my chest instead of in his ears. When you've emptied yourself of the unsaid, the moment of death loses some of its power over you. The second: the last memory I have of my dad is not tubes down his throat. It is </w:t>
-      </w:r>
-      <w:r>
-        <w:rPr>
-          <w:i/>
-          <w:iCs/>
-        </w:rPr>
-        <w:t xml:space="preserve">him</w:t>
-      </w:r>
-      <w:r>
-        <w:t xml:space="preserve">.</w:t>
-      </w:r>
-    </w:p>
-    <w:p>
-      <w:pPr>
-        <w:spacing w:line="480"/>
-        <w:ind w:firstLine="720"/>
-        <w:jc w:val="left"/>
-      </w:pPr>
-      <w:r>
-        <w:t xml:space="preserve">Here's something families worry about: </w:t>
-      </w:r>
-      <w:r>
-        <w:rPr>
-          <w:i/>
-          <w:iCs/>
-        </w:rPr>
-        <w:t xml:space="preserve">what if he can't really take it in anymore?</w:t>
-      </w:r>
-      <w:r>
-        <w:t xml:space="preserve"> Say it anyway. The words matter even when you can't be sure they land — because closure isn't only for the one who hears. It is for the one who speaks. And do not wait for the last days to say what matters. The last days are too late for meaningful conversations. The right time is now, at a kitchen table, while the person you love can still answer you back.</w:t>
-      </w:r>
-    </w:p>
-    <w:p>
-      <w:pPr>
-        <w:spacing w:line="480"/>
-        <w:ind w:firstLine="720"/>
-        <w:jc w:val="left"/>
-      </w:pPr>
-      <w:r>
-        <w:t xml:space="preserve">Two conversations, then. The practical one — wishes, decisions, money, orders — which this chapter will walk you through, question by question. And the love one, which only you can script.</w:t>
+        <w:t xml:space="preserve">But there is a second kind of unsaid — and that kind, I finished. I said everything to my father while he could still answer me back. I was not in the room when he died; that story belongs to Chapter 27. What I can tell you here is that the words I had already said are what let me survive it.</w:t>
+      </w:r>
+    </w:p>
+    <w:p>
+      <w:pPr>
+        <w:spacing w:line="480"/>
+        <w:ind w:firstLine="720"/>
+        <w:jc w:val="left"/>
+      </w:pPr>
+      <w:r>
+        <w:t xml:space="preserve">So don't save the practical conversations for the end. The last days are too late for the practical conversations — and never too late for the loving ones. If the last days are where you are right now, go to Chapter 28, and keep talking to them. For everything else, the right time is now, at a kitchen table, while the person you love can still answer you back.</w:t>
+      </w:r>
+    </w:p>
+    <w:p>
+      <w:pPr>
+        <w:spacing w:line="480"/>
+        <w:ind w:firstLine="720"/>
+        <w:jc w:val="left"/>
+      </w:pPr>
+      <w:r>
+        <w:t xml:space="preserve">Two conversations, then. The practical one — wishes, decisions, money, orders — which this chapter walks you through, question by question. And the love one, which only you can script.</w:t>
       </w:r>
     </w:p>
     <w:p>
@@ -1962,27 +1882,17 @@
         <w:jc w:val="left"/>
       </w:pPr>
       <w:r>
-        <w:t xml:space="preserve">My dad spent his last week at Baptist Hospital. The family gathered — my brothers John, Joel, and Chris, my sister Lisa, my stepmom at his side.</w:t>
-      </w:r>
-    </w:p>
-    <w:p>
-      <w:pPr>
-        <w:spacing w:line="480"/>
-        <w:ind w:firstLine="720"/>
-        <w:jc w:val="left"/>
-      </w:pPr>
-      <w:r>
-        <w:t xml:space="preserve">I wasn't there.</w:t>
-      </w:r>
-    </w:p>
-    <w:p>
-      <w:pPr>
-        <w:spacing w:line="480"/>
-        <w:ind w:firstLine="720"/>
-        <w:jc w:val="left"/>
-      </w:pPr>
-      <w:r>
-        <w:t xml:space="preserve">I want to tell you why, because it is the reason this book has the title it has.</w:t>
+        <w:t xml:space="preserve">My dad spent his last week at Baptist Hospital. The family gathered — my brothers and sister, my stepmom at his side.</w:t>
+      </w:r>
+    </w:p>
+    <w:p>
+      <w:pPr>
+        <w:spacing w:line="480"/>
+        <w:ind w:firstLine="720"/>
+        <w:jc w:val="left"/>
+      </w:pPr>
+      <w:r>
+        <w:t xml:space="preserve">I wasn't there. I want to tell you why.</w:t>
       </w:r>
     </w:p>
     <w:p>
@@ -2002,7 +1912,7 @@
         <w:jc w:val="left"/>
       </w:pPr>
       <w:r>
-        <w:t xml:space="preserve">Then, in the last days before Christmas — the twenty-third, maybe the twenty-fourth — pneumonia set in. My wife and I sat together looking at flights. There were no good flights on Christmas. There almost never are. So we made the plan: we would drive down on Friday.</w:t>
+        <w:t xml:space="preserve">Then, in the last days before Christmas, pneumonia set in. My wife and I sat together looking at flights. There were no good flights on Christmas. There almost never are. So we made the plan: we would drive down on Friday.</w:t>
       </w:r>
     </w:p>
     <w:p>
@@ -2032,37 +1942,37 @@
         <w:jc w:val="left"/>
       </w:pPr>
       <w:r>
-        <w:t xml:space="preserve">My brother had been calling. So had my stepmom. But what I heard in those calls was that she was held — my brothers and sister were in town, and the support around my dad's bed was strong. My being there was not what that room was missing.</w:t>
-      </w:r>
-    </w:p>
-    <w:p>
-      <w:pPr>
-        <w:spacing w:line="480"/>
-        <w:ind w:firstLine="720"/>
-        <w:jc w:val="left"/>
-      </w:pPr>
-      <w:r>
-        <w:t xml:space="preserve">He died on Christmas Day, and I was not in the room.</w:t>
-      </w:r>
-    </w:p>
-    <w:p>
-      <w:pPr>
-        <w:spacing w:line="480"/>
-        <w:ind w:firstLine="720"/>
-        <w:jc w:val="left"/>
-      </w:pPr>
-      <w:r>
-        <w:t xml:space="preserve">Now here is the part I need to be honest about, because it is the reason this book has the title it has. At first, I did not feel guilty. I had made a real choice between two parents who needed me. I had said everything to my father long before that week. He was surrounded by people who loved him. I was at peace.</w:t>
-      </w:r>
-    </w:p>
-    <w:p>
-      <w:pPr>
-        <w:spacing w:line="480"/>
-        <w:ind w:firstLine="720"/>
-        <w:jc w:val="left"/>
-      </w:pPr>
-      <w:r>
-        <w:t xml:space="preserve">The guilt came later — and it came from the outside. When the backlash from the family started, that is when </w:t>
+        <w:t xml:space="preserve">My brothers had been calling. So had my stepmom. But what I heard in those calls was that she was held — the family was in town, and the support around my dad's bed was strong. My being there was not what that room was missing.</w:t>
+      </w:r>
+    </w:p>
+    <w:p>
+      <w:pPr>
+        <w:spacing w:line="480"/>
+        <w:ind w:firstLine="720"/>
+        <w:jc w:val="left"/>
+      </w:pPr>
+      <w:r>
+        <w:t xml:space="preserve">Here is the part I need to be honest about, because it is the reason this book has the title it has. At first, I did not feel guilty. I had made a real choice between two parents who needed me. I had said everything to my father long before that week — no forgiveness withheld, nothing I was still saving up to say. And the last memory I have of my dad is not tubes and machines. It is </w:t>
+      </w:r>
+      <w:r>
+        <w:rPr>
+          <w:i/>
+          <w:iCs/>
+        </w:rPr>
+        <w:t xml:space="preserve">him</w:t>
+      </w:r>
+      <w:r>
+        <w:t xml:space="preserve">.</w:t>
+      </w:r>
+    </w:p>
+    <w:p>
+      <w:pPr>
+        <w:spacing w:line="480"/>
+        <w:ind w:firstLine="720"/>
+        <w:jc w:val="left"/>
+      </w:pPr>
+      <w:r>
+        <w:t xml:space="preserve">The guilt came later, and it came from the outside. When the backlash from the family started, that is when </w:t>
       </w:r>
       <w:r>
         <w:rPr>
@@ -2082,54 +1992,37 @@
         <w:jc w:val="left"/>
       </w:pPr>
       <w:r>
-        <w:t xml:space="preserve">I want to say something to whoever needs it: sometimes "it's your fault" is not even your own sentence. Someone hands it to you — grieving, angry, in the worst week of their lives — and you carry it as if it were yours. You are allowed to put it down. Grief makes scorekeepers out of loving people; the score was never real.</w:t>
-      </w:r>
-    </w:p>
-    <w:p>
-      <w:pPr>
-        <w:spacing w:line="480"/>
-        <w:ind w:firstLine="720"/>
-        <w:jc w:val="left"/>
-      </w:pPr>
-      <w:r>
-        <w:t xml:space="preserve">And I owe you the rest of the truth, because you've been honest enough to read this far. It is still painful for me to talk about what happened. To this day. It still hurts, and there are things I would have done differently — I live with both. I am not writing to you from the other side of healed. I am writing from inside the healing, and there is more of this story that I will be able to tell as I get further along. When I can, I will.</w:t>
-      </w:r>
-    </w:p>
-    <w:p>
-      <w:pPr>
-        <w:spacing w:line="480"/>
-        <w:ind w:firstLine="720"/>
-        <w:jc w:val="left"/>
-      </w:pPr>
-      <w:r>
-        <w:t xml:space="preserve">I do this work for a living. I have stood in hospital hallways with a hundred families and told them the truth about last days — that they cannot be scheduled, that the timing belongs to no one. And when it was my own father, I still believed I had a couple more days. That is how it goes. Nobody times it right. </w:t>
-      </w:r>
-      <w:r>
-        <w:rPr>
-          <w:i/>
-          <w:iCs/>
-        </w:rPr>
-        <w:t xml:space="preserve">That is the point of this chapter.</w:t>
-      </w:r>
-    </w:p>
-    <w:p>
-      <w:pPr>
-        <w:spacing w:line="480"/>
-        <w:ind w:firstLine="720"/>
-        <w:jc w:val="left"/>
-      </w:pPr>
-      <w:r>
-        <w:t xml:space="preserve">A last-days plan is not about controlling death. Death does not take instructions. A plan is about deciding — </w:t>
-      </w:r>
-      <w:r>
-        <w:rPr>
-          <w:i/>
-          <w:iCs/>
-        </w:rPr>
-        <w:t xml:space="preserve">before</w:t>
-      </w:r>
-      <w:r>
-        <w:t xml:space="preserve"> the last week — what matters most, who needs to be there, who calls whom, what he would want in the room, and what you will do when it happens faster than anyone believed. Not so the plan goes perfectly. So that whatever happens, you know you did what could be done — and the rest was never yours to carry.</w:t>
+        <w:t xml:space="preserve">So I want to say something to whoever needs it: sometimes "it's your fault" is not even your own sentence. Someone hands it to you — grieving, angry, in the worst week of their lives — and you carry it as if it were yours. You are allowed to put it down. Grief turns loving people into scorekeepers. There was never a score.</w:t>
+      </w:r>
+    </w:p>
+    <w:p>
+      <w:pPr>
+        <w:spacing w:line="480"/>
+        <w:ind w:firstLine="720"/>
+        <w:jc w:val="left"/>
+      </w:pPr>
+      <w:r>
+        <w:t xml:space="preserve">And I owe you the rest of the truth. It is still painful to talk about what happened, to this day, and there are things I would have done differently. I am not writing to you from someplace healed. I am writing from inside the healing, and I will tell more of this story as I can.</w:t>
+      </w:r>
+    </w:p>
+    <w:p>
+      <w:pPr>
+        <w:spacing w:line="480"/>
+        <w:ind w:firstLine="720"/>
+        <w:jc w:val="left"/>
+      </w:pPr>
+      <w:r>
+        <w:t xml:space="preserve">I do this work for a living. I have stood in hospital hallways with a hundred families and told them the truth about last days: they cannot be scheduled. The timing belongs to no one. And when it was my own father, I still believed I had a couple more days. Nobody times it right. That is the point of this chapter.</w:t>
+      </w:r>
+    </w:p>
+    <w:p>
+      <w:pPr>
+        <w:spacing w:line="480"/>
+        <w:ind w:firstLine="720"/>
+        <w:jc w:val="left"/>
+      </w:pPr>
+      <w:r>
+        <w:t xml:space="preserve">A last-days plan is not about controlling death. Death does not take instructions. A plan is about deciding, before the last week, what matters most: who needs to be there, who calls whom, what he would want in the room, and what you will do when it happens faster than anyone believed. Not so the plan goes perfectly — so that whatever happens, you know you did what could be done. The rest was never yours to carry.</w:t>
       </w:r>
     </w:p>
     <w:p>
@@ -2187,7 +2080,7 @@
         <w:jc w:val="left"/>
       </w:pPr>
       <w:r>
-        <w:t xml:space="preserve">I have been in the room for the last days more times than I can count. And I can tell you what frightens families the most. It is not death. It is not knowing.</w:t>
+        <w:t xml:space="preserve">I have been in the room for the last days more times than I can count. And I can tell you what frightens families the most. It is not death. It is the not knowing.</w:t>
       </w:r>
     </w:p>
     <w:p>
@@ -2207,17 +2100,17 @@
         <w:jc w:val="left"/>
       </w:pPr>
       <w:r>
-        <w:t xml:space="preserve">So let me tell you what I know, so that you can walk in prepared.</w:t>
-      </w:r>
-    </w:p>
-    <w:p>
-      <w:pPr>
-        <w:spacing w:line="480"/>
-        <w:ind w:firstLine="720"/>
-        <w:jc w:val="left"/>
-      </w:pPr>
-      <w:r>
-        <w:t xml:space="preserve">They will sleep more. Then more than that. Eating and drinking will fade — and this is where families struggle hardest, because food is how we love people. You will want to coax one more bite. Hear me: near the end, the body is finished with food. It is not starving; it is shutting down the systems it no longer needs. Forcing food and fluids doesn't add days. It adds discomfort.</w:t>
+        <w:t xml:space="preserve">So let me tell you what I have watched at hundreds of bedsides, and what the hospice nurses and doctors taught me standing next to them — so that you can walk in prepared.</w:t>
+      </w:r>
+    </w:p>
+    <w:p>
+      <w:pPr>
+        <w:spacing w:line="480"/>
+        <w:ind w:firstLine="720"/>
+        <w:jc w:val="left"/>
+      </w:pPr>
+      <w:r>
+        <w:t xml:space="preserve">They will sleep more. Then more than that. Eating and drinking will fade — and this is where families struggle hardest, because food is how we love people. You will want to coax one more bite. Hear me: near the end, the body is finished with food. It is not starving. It is shutting down the systems it no longer needs, and forcing food and fluids doesn't add days — it adds discomfort. Offering is still allowed: sips and tastes for pleasure, mouth care for comfort. Offer. Never force.</w:t>
       </w:r>
     </w:p>
     <w:p>
@@ -2237,17 +2130,17 @@
         <w:jc w:val="left"/>
       </w:pPr>
       <w:r>
-        <w:t xml:space="preserve">There may be restlessness. And there may be visions — reaching for things you cannot see, conversations with people who died years ago. I have stopped trying to explain this. I only know that it happens, that it is common, and that the dying are usually not frightened by it. More often, they seem comforted. You already know what to do, because it's the same thing I taught you in the dementia chapter: don't argue with their reality. Join it.</w:t>
-      </w:r>
-    </w:p>
-    <w:p>
-      <w:pPr>
-        <w:spacing w:line="480"/>
-        <w:ind w:firstLine="720"/>
-        <w:jc w:val="left"/>
-      </w:pPr>
-      <w:r>
-        <w:t xml:space="preserve">Then there is the rally. One day — often near the very end — they may wake up clear. Alert, talking, maybe hungry, asking for people. Families take it as a turnaround. I have watched it break hearts twice for that reason. The rally is real, but it is usually not a recovery. It is a gift. Treat it like one: gather, say everything, laugh if there's laughing to do. It is often the last good day, arriving on purpose.</w:t>
+        <w:t xml:space="preserve">There may be restlessness. And there may be visions — reaching for things you cannot see, conversations with people who died years ago. I have stopped trying to explain this. I only know that it happens, that it is common, and that the dying are usually not frightened by it. More often, they seem comforted. You already know what to do, because it's the same thing I taught you in the dementia chapter: don't argue with their reality. Join it. But restlessness that looks like distress is different — that one you report. The team can treat it.</w:t>
+      </w:r>
+    </w:p>
+    <w:p>
+      <w:pPr>
+        <w:spacing w:line="480"/>
+        <w:ind w:firstLine="720"/>
+        <w:jc w:val="left"/>
+      </w:pPr>
+      <w:r>
+        <w:t xml:space="preserve">Then there is the rally. One day — often near the very end — they may wake up clear. Alert, talking, maybe hungry, asking for people. Families take it as a turnaround. I have watched it break hearts twice for that reason. The rally is real, but it is usually not a recovery. It is a gift. Treat it like one: gather, say everything, laugh if there's laughing to do. It is often the last good day.</w:t>
       </w:r>
     </w:p>
     <w:p>
@@ -2267,7 +2160,17 @@
         <w:t xml:space="preserve">keep talking to them.</w:t>
       </w:r>
       <w:r>
-        <w:t xml:space="preserve"> Hearing stays long after responding stops. The person in that bed can very likely still hear you. Say the things. None of it is wasted.</w:t>
+        <w:t xml:space="preserve"> Hearing stays long after responding stops. No one can prove what reaches them, so we assume it all does. Say the things. None of it is wasted.</w:t>
+      </w:r>
+    </w:p>
+    <w:p>
+      <w:pPr>
+        <w:spacing w:line="480"/>
+        <w:ind w:firstLine="720"/>
+        <w:jc w:val="left"/>
+      </w:pPr>
+      <w:r>
+        <w:t xml:space="preserve">One more thing about the fear of the phone. When hospice is on board and death is expected, the number to call is the hospice line, not 911. It answers twenty-four hours a day, and it exists for exactly these hours — for any change, and for any fear, at 2 a.m. as much as 2 p.m.</w:t>
       </w:r>
     </w:p>
     <w:p>
@@ -2395,17 +2298,7 @@
         <w:jc w:val="left"/>
       </w:pPr>
       <w:r>
-        <w:t xml:space="preserve">The rest of this chapter walks you through what those first days actually ask of you — the calls, the funeral home, the practical tasks that arrive whether you are ready or not — and the weeks after, which nobody talks about at all. Take it slowly. Take </w:t>
-      </w:r>
-      <w:r>
-        <w:rPr>
-          <w:i/>
-          <w:iCs/>
-        </w:rPr>
-        <w:t xml:space="preserve">everything</w:t>
-      </w:r>
-      <w:r>
-        <w:t xml:space="preserve"> slowly. There is no stopwatch on any of it.</w:t>
+        <w:t xml:space="preserve">The rest of this chapter walks you through those first days — the calls, the funeral home, the practical tasks that arrive whether you are ready or not — and the weeks after, which nobody talks about at all. Take everything slowly. There is no stopwatch on any of it.</w:t>
       </w:r>
     </w:p>
     <w:p>

</xml_diff>

<commit_message>
Rebuild manuscript (docx and PDF) from the de-AI revision
Co-Authored-By: Claude Fable 5 <noreply@anthropic.com>
Claude-Session: https://claude.ai/code/session_01NnyH8bZ2fKPqNGQkoaqehQ
</commit_message>
<xml_diff>
--- a/cardinals-promise/manuscript/chapter-openers-manuscript.docx
+++ b/cardinals-promise/manuscript/chapter-openers-manuscript.docx
@@ -323,7 +323,7 @@
         <w:jc w:val="left"/>
       </w:pPr>
       <w:r>
-        <w:t xml:space="preserve">That was 2015. He lived ten more years. And everything that fills this book — every decision, every hard day, every conversation — started with one phone call I never saw coming.</w:t>
+        <w:t xml:space="preserve">That was 2015. He lived ten more years. And everything that fills this book started with one phone call I never saw coming. Every decision, every hard day, every conversation.</w:t>
       </w:r>
     </w:p>
     <w:p>
@@ -343,7 +343,7 @@
         <w:jc w:val="left"/>
       </w:pPr>
       <w:r>
-        <w:t xml:space="preserve">And whatever you think you should have seen coming before your moment — you couldn't have. We couldn't either. It's not your fault. That's why those words are on the cover.</w:t>
+        <w:t xml:space="preserve">And whatever you think you should have seen coming before your moment, you couldn't have. We couldn't either. It's not your fault. That's why those words are on the cover.</w:t>
       </w:r>
     </w:p>
     <w:p>
@@ -441,7 +441,7 @@
         <w:jc w:val="left"/>
       </w:pPr>
       <w:r>
-        <w:t xml:space="preserve">Eight years earlier, I had taken the first call sitting on a couch. Now I was on another couch, taking another one. The same helpless feeling, arriving the same way — in the middle of an ordinary night.</w:t>
+        <w:t xml:space="preserve">Eight years earlier, I had taken the first call sitting on a couch. Now I was on another couch, taking another one. The same helpless feeling, arriving the same way, in the middle of an ordinary night.</w:t>
       </w:r>
     </w:p>
     <w:p>
@@ -481,7 +481,7 @@
         <w:jc w:val="left"/>
       </w:pPr>
       <w:r>
-        <w:t xml:space="preserve">A fall is never just a fall. Weakness is never just getting older. They are information. Read them early enough, and you get to make decisions instead of reacting. And nobody catches everything — I didn't, and this is my profession. But once you know what a fall is trying to tell you, the next one becomes information instead of just fear.</w:t>
+        <w:t xml:space="preserve">A fall is never just a fall. Weakness is never just getting older. They are information. Read them early enough, and you get to make decisions instead of reacting. And nobody catches everything. I didn't, and this is my profession. But once you know what a fall is trying to tell you, the next one becomes information instead of just fear.</w:t>
       </w:r>
     </w:p>
     <w:p>
@@ -529,7 +529,7 @@
         <w:jc w:val="left"/>
       </w:pPr>
       <w:r>
-        <w:t xml:space="preserve">My first experience with dementia was professional. Home health — other people's families, other people's parents. My first real one was Nana, my mom's mom.</w:t>
+        <w:t xml:space="preserve">My first experience with dementia was professional. Home health: other people's families, other people's parents. My first real one was Nana, my mom's mom.</w:t>
       </w:r>
     </w:p>
     <w:p>
@@ -569,7 +569,7 @@
         <w:jc w:val="left"/>
       </w:pPr>
       <w:r>
-        <w:t xml:space="preserve">Stop right there. Hear those words from your own grandmother and everything in you reacts. Part of you wants to panic. Part of you wants to correct her — </w:t>
+        <w:t xml:space="preserve">Stop right there. Hear those words from your own grandmother and everything in you reacts. Part of you wants to panic. Part of you wants to correct her. </w:t>
       </w:r>
       <w:r>
         <w:rPr>
@@ -626,7 +626,7 @@
         <w:jc w:val="left"/>
       </w:pPr>
       <w:r>
-        <w:t xml:space="preserve">The therapists. Strangers moving her body through exercises she didn't remember agreeing to, in a building she didn't remember arriving at. Her words were frightening. Her reality made sense — once I stopped standing outside of it and started asking about it.</w:t>
+        <w:t xml:space="preserve">The therapists. Strangers moving her body through exercises she didn't remember agreeing to, in a building she didn't remember arriving at. Her words were frightening. Her reality made sense once I stopped standing outside of it and started asking about it.</w:t>
       </w:r>
     </w:p>
     <w:p>
@@ -646,7 +646,7 @@
         <w:jc w:val="left"/>
       </w:pPr>
       <w:r>
-        <w:t xml:space="preserve">There were other changes. She told stories from many years ago as if they had happened that morning. And there was a crudeness that was never her — my grandmother was a proper woman her whole life. The disease took her memory. It took her manners too.</w:t>
+        <w:t xml:space="preserve">There were other changes. She told stories from many years ago as if they had happened that morning. And there was a crudeness that was never her. My grandmother was a proper woman her whole life. The disease took her memory. It took her manners too.</w:t>
       </w:r>
     </w:p>
     <w:p>
@@ -724,27 +724,27 @@
         <w:jc w:val="left"/>
       </w:pPr>
       <w:r>
-        <w:t xml:space="preserve">Through everything — the cancer in 2015, the tumor the fall found in 2023 — we never sat down, all of us, and talked about what would happen if Dad declined. His will. His house. His money. What he wanted, and how any of it would be paid for.</w:t>
-      </w:r>
-    </w:p>
-    <w:p>
-      <w:pPr>
-        <w:spacing w:line="480"/>
-        <w:ind w:firstLine="720"/>
-        <w:jc w:val="left"/>
-      </w:pPr>
-      <w:r>
-        <w:t xml:space="preserve">He had told my stepmom some things. He wanted to be buried; she knew a few of his wishes. But that was it — pieces of a plan, living in one person's memory. There was no meeting. There was no list. And none of us asked the money question. Not one of us. Not even me, and I do this for a living.</w:t>
-      </w:r>
-    </w:p>
-    <w:p>
-      <w:pPr>
-        <w:spacing w:line="480"/>
-        <w:ind w:firstLine="720"/>
-        <w:jc w:val="left"/>
-      </w:pPr>
-      <w:r>
-        <w:t xml:space="preserve">We didn't avoid it out of carelessness. We avoided it out of love — the kind that doesn't want to say the hard thing out loud, as if the conversation itself could bring the day closer. It doesn't. The conversation only decides whether you will be ready when the day comes on its own.</w:t>
+        <w:t xml:space="preserve">Through the cancer in 2015 and the tumor the fall found in 2023, we never sat down, all of us, and talked about what would happen if Dad declined. His will. His house. His money. What he wanted, and how any of it would be paid for.</w:t>
+      </w:r>
+    </w:p>
+    <w:p>
+      <w:pPr>
+        <w:spacing w:line="480"/>
+        <w:ind w:firstLine="720"/>
+        <w:jc w:val="left"/>
+      </w:pPr>
+      <w:r>
+        <w:t xml:space="preserve">He had told my stepmom some things. He wanted to be buried. She knew a few of his wishes. But that was it: pieces of a plan, living in one person's memory. There was no meeting. There was no list. And none of us asked the money question. Not one of us. Not even me, and I do this for a living.</w:t>
+      </w:r>
+    </w:p>
+    <w:p>
+      <w:pPr>
+        <w:spacing w:line="480"/>
+        <w:ind w:firstLine="720"/>
+        <w:jc w:val="left"/>
+      </w:pPr>
+      <w:r>
+        <w:t xml:space="preserve">We didn't avoid it out of carelessness. We avoided it out of love, the kind that doesn't want to say the hard thing out loud, as if the conversation itself could bring the day closer. It doesn't. The conversation only decides whether you will be ready when the day comes on its own.</w:t>
       </w:r>
     </w:p>
     <w:p>
@@ -832,17 +832,17 @@
         <w:t xml:space="preserve">"I gotta go home." "I'm not supposed to be here."</w:t>
       </w:r>
       <w:r>
-        <w:t xml:space="preserve"> Those may be the most common words spoken in memory care, and some of the most heartbreaking. Everything in an untrained person wants to answer them with the truth — </w:t>
-      </w:r>
-      <w:r>
-        <w:rPr>
-          <w:i/>
-          <w:iCs/>
-        </w:rPr>
-        <w:t xml:space="preserve">you live here now</w:t>
-      </w:r>
-      <w:r>
-        <w:t xml:space="preserve"> — and that answer only turns fear into a fight.</w:t>
+        <w:t xml:space="preserve"> Those may be the most common words spoken in memory care, and some of the most heartbreaking. Everything in an untrained person wants to answer them with the truth. </w:t>
+      </w:r>
+      <w:r>
+        <w:rPr>
+          <w:i/>
+          <w:iCs/>
+        </w:rPr>
+        <w:t xml:space="preserve">You live here now.</w:t>
+      </w:r>
+      <w:r>
+        <w:t xml:space="preserve"> And that answer only turns fear into a fight.</w:t>
       </w:r>
     </w:p>
     <w:p>
@@ -882,7 +882,7 @@
         <w:jc w:val="left"/>
       </w:pPr>
       <w:r>
-        <w:t xml:space="preserve">By the time the meal was done, the urge to leave had passed the same way it arrived — as a fleeting thought.</w:t>
+        <w:t xml:space="preserve">By the time the meal was done, the urge to leave had passed the same way it arrived, as a fleeting thought.</w:t>
       </w:r>
     </w:p>
     <w:p>
@@ -902,7 +902,7 @@
         <w:jc w:val="left"/>
       </w:pPr>
       <w:r>
-        <w:t xml:space="preserve">The other thing I watched work behind those doors was music. Play a song from a resident's younger years — the music of their formative decades — and someone deep into dementia would recognize it and sing the lyrics. Every word. The disease takes so much, but it takes the music last.</w:t>
+        <w:t xml:space="preserve">The other thing I watched work behind those doors was music. Play a song from a resident's younger years, and someone deep into dementia would recognize it and sing the lyrics. Every word. The disease takes so much, but it takes the music last.</w:t>
       </w:r>
     </w:p>
     <w:p>
@@ -960,7 +960,7 @@
         <w:jc w:val="left"/>
       </w:pPr>
       <w:r>
-        <w:t xml:space="preserve">Marion and Frank are family friends. Frank fell and broke his hip, and he was admitted to the local hospital. His daughter stepped in as his primary caregiver — and the family called me with one question: </w:t>
+        <w:t xml:space="preserve">Marion and Frank are family friends. Frank fell and broke his hip, and he was admitted to the local hospital. His daughter stepped in as his primary caregiver. The family called me with one question: </w:t>
       </w:r>
       <w:r>
         <w:rPr>
@@ -987,7 +987,7 @@
         <w:jc w:val="left"/>
       </w:pPr>
       <w:r>
-        <w:t xml:space="preserve">Here is what I carried into that call that they didn't — the thing every rehab team I ever worked alongside knew: a broken hip after seventy-five is one of the hardest recoveries in all of elder care. A significant number of people who go into rehab for a hip never make it back to the life they had before. Many will need a higher level of care when rehab ends.</w:t>
+        <w:t xml:space="preserve">Here is what I carried into that call that they didn't, the thing every rehab team I ever worked alongside knew: a broken hip after seventy-five is one of the hardest recoveries in all of elder care. A lot of people who go into rehab for a hip never make it back to the life they had before. Many will need a higher level of care when rehab ends.</w:t>
       </w:r>
     </w:p>
     <w:p>
@@ -1007,7 +1007,7 @@
         <w:jc w:val="left"/>
       </w:pPr>
       <w:r>
-        <w:t xml:space="preserve">So that's what I told them, and it's what I'm telling you. Hold both. Cheer the recovery like it's going to work, and quietly start learning what comes next in case it doesn't. That is not pessimism. That is showing up prepared.</w:t>
+        <w:t xml:space="preserve">So that's what I told them, and it's what I'm telling you. Hold both. Cheer the recovery like it's going to work, and quietly start learning what comes next in case it doesn't. That isn't pessimism. That's being prepared.</w:t>
       </w:r>
     </w:p>
     <w:p>
@@ -1075,17 +1075,17 @@
         <w:jc w:val="left"/>
       </w:pPr>
       <w:r>
-        <w:t xml:space="preserve">I got sober on January 9, 2009, and part of staying sober is helping other people get sober. Some of the people I sponsored didn't make it. They were young — most of their life still owed to them — and sitting with their families afterward is where I learned what a robbed life looks like, and how to stay in a room full of pain without running.</w:t>
-      </w:r>
-    </w:p>
-    <w:p>
-      <w:pPr>
-        <w:spacing w:line="480"/>
-        <w:ind w:firstLine="720"/>
-        <w:jc w:val="left"/>
-      </w:pPr>
-      <w:r>
-        <w:t xml:space="preserve">A hospice patient's life is not a robbed life. Most have lived full ones — work, marriages, grandchildren around a table. And when they haven't, hospice holds those families closest of all. Hospice takes nothing from anyone. It gives. Comfort instead of pain. Somebody in the room instead of machines. When I tell a family that choosing hospice is a gift, I am not softening anything. I have seen the alternative, and it is not a longer life. It is a harder death.</w:t>
+        <w:t xml:space="preserve">I got sober on January 9, 2009, and part of staying sober is helping other people get sober. Some of the people I sponsored didn't make it. They were young, most of their life still owed to them, and sitting with their families afterward is where I learned what a robbed life looks like, and how to stay in a room full of pain without running.</w:t>
+      </w:r>
+    </w:p>
+    <w:p>
+      <w:pPr>
+        <w:spacing w:line="480"/>
+        <w:ind w:firstLine="720"/>
+        <w:jc w:val="left"/>
+      </w:pPr>
+      <w:r>
+        <w:t xml:space="preserve">A hospice patient's life is not a robbed life. Most have lived full ones: work, marriages, grandchildren around a table. And when they haven't, hospice holds those families closest of all. Hospice takes nothing from anyone. It gives. Comfort instead of pain. Somebody in the room instead of machines. When I tell a family that choosing hospice is a gift, I am not softening anything. I have seen the alternative, and it is not a longer life. It is a harder death.</w:t>
       </w:r>
     </w:p>
     <w:p>
@@ -1105,17 +1105,17 @@
         <w:jc w:val="left"/>
       </w:pPr>
       <w:r>
-        <w:t xml:space="preserve">At the end, his comfort was real. He did not suffer his way out of this world. And I want to say something plainly, because I know how end-of-life comfort care gets read: the morphine does not bring the morning closer. It is started because the morning has come. Given right — the right dose, for the pain that is actually there — it takes nothing but the suffering. And that comfort wasn't luck, and it wasn't inside knowledge. It is what a hospice team brings into every home. Including yours.</w:t>
-      </w:r>
-    </w:p>
-    <w:p>
-      <w:pPr>
-        <w:spacing w:line="480"/>
-        <w:ind w:firstLine="720"/>
-        <w:jc w:val="left"/>
-      </w:pPr>
-      <w:r>
-        <w:t xml:space="preserve">Now when I sit with a family, I am not speaking from training. I have lived the same pain they are living — including the weight of the decisions that fall to the family at the end, when the patient no longer can make them.</w:t>
+        <w:t xml:space="preserve">At the end, his comfort was real. He did not suffer his way out of this world. And I want to say something plainly, because I know how end-of-life comfort care gets read: the morphine does not bring the morning closer. It is started because the morning has come. Given right, at the right dose, for the pain that is actually there, it takes nothing but the suffering. And that comfort wasn't luck, and it wasn't inside knowledge. It is what a hospice team brings into every home. Including yours.</w:t>
+      </w:r>
+    </w:p>
+    <w:p>
+      <w:pPr>
+        <w:spacing w:line="480"/>
+        <w:ind w:firstLine="720"/>
+        <w:jc w:val="left"/>
+      </w:pPr>
+      <w:r>
+        <w:t xml:space="preserve">Now when I sit with a family, I am not speaking from training. I have lived the same pain they are living. That includes the weight of the decisions that fall to the family at the end, when the patient no longer can make them.</w:t>
       </w:r>
     </w:p>
     <w:p>
@@ -1180,7 +1180,7 @@
         <w:jc w:val="left"/>
       </w:pPr>
       <w:r>
-        <w:t xml:space="preserve">I want to tell you about a patient who lived in a million-dollar home — because the family almost didn't fill out the paperwork.</w:t>
+        <w:t xml:space="preserve">I want to tell you about a patient who lived in a million-dollar home, because the family almost didn't fill out the paperwork.</w:t>
       </w:r>
     </w:p>
     <w:p>
@@ -1210,7 +1210,7 @@
         <w:t xml:space="preserve">income</w:t>
       </w:r>
       <w:r>
-        <w:t xml:space="preserve">, not net worth. Nobody counts the house. What counted was what came in each month — Social Security and investment income — and that number fell below the threshold. The patient qualified.</w:t>
+        <w:t xml:space="preserve">, not net worth. Nobody counts the house. What counted was what came in each month: Social Security and investment income. That number fell below the threshold. The patient qualified.</w:t>
       </w:r>
     </w:p>
     <w:p>
@@ -1240,7 +1240,7 @@
         <w:jc w:val="left"/>
       </w:pPr>
       <w:r>
-        <w:t xml:space="preserve">One warning before you run with that rule: some programs later in this book do ask about savings. Medicaid asks hardest — for that one, get a guide before you file. But never do a program's math for it.</w:t>
+        <w:t xml:space="preserve">One warning before you run with that rule: some programs later in this book do ask about savings. Medicaid asks hardest. For that one, get a guide before you file. But never do a program's math for it.</w:t>
       </w:r>
     </w:p>
     <w:p>
@@ -1308,27 +1308,27 @@
         <w:jc w:val="left"/>
       </w:pPr>
       <w:r>
-        <w:t xml:space="preserve">The cardiologist prescribes it by its brand name. The primary care doctor — different office, different network, computer systems that do not talk to each other — prescribes the same drug as a generic. Two different names. Two different bottles. The same drug inside both.</w:t>
-      </w:r>
-    </w:p>
-    <w:p>
-      <w:pPr>
-        <w:spacing w:line="480"/>
-        <w:ind w:firstLine="720"/>
-        <w:jc w:val="left"/>
-      </w:pPr>
-      <w:r>
-        <w:t xml:space="preserve">The patient fills both prescriptions, because a doctor ordered each one. Takes both, because they're on the med list. And nobody catches it — because the two doctors have never spoken, and the only person who ever sees every bottle in the house is the family.</w:t>
-      </w:r>
-    </w:p>
-    <w:p>
-      <w:pPr>
-        <w:spacing w:line="480"/>
-        <w:ind w:firstLine="720"/>
-        <w:jc w:val="left"/>
-      </w:pPr>
-      <w:r>
-        <w:t xml:space="preserve">For painkillers and a handful of other controlled drugs, there is a partial safety net: state monitoring programs a pharmacist or doctor can check. For everything else, there are exactly two nets. The first is simple, and I am begging you to use it — fill every prescription at one pharmacy, so one computer sees every bottle. The second net is you.</w:t>
+        <w:t xml:space="preserve">The cardiologist prescribes it by its brand name. The primary care doctor (different office, different network, computer systems that do not talk to each other) prescribes the same drug as a generic. Two different names. Two different bottles. The same drug inside both.</w:t>
+      </w:r>
+    </w:p>
+    <w:p>
+      <w:pPr>
+        <w:spacing w:line="480"/>
+        <w:ind w:firstLine="720"/>
+        <w:jc w:val="left"/>
+      </w:pPr>
+      <w:r>
+        <w:t xml:space="preserve">The patient fills both prescriptions, because a doctor ordered each one. Takes both, because they're on the med list. And nobody catches it, because the two doctors have never spoken, and the only person who ever sees every bottle in the house is the family.</w:t>
+      </w:r>
+    </w:p>
+    <w:p>
+      <w:pPr>
+        <w:spacing w:line="480"/>
+        <w:ind w:firstLine="720"/>
+        <w:jc w:val="left"/>
+      </w:pPr>
+      <w:r>
+        <w:t xml:space="preserve">For painkillers and a handful of other controlled drugs, there is a partial safety net: state monitoring programs a pharmacist or doctor can check. For everything else, there are exactly two nets. The first is simple, and I am begging you to use it: fill every prescription at one pharmacy, so one computer sees every bottle. The second net is you.</w:t>
       </w:r>
     </w:p>
     <w:p>
@@ -1348,7 +1348,7 @@
         <w:jc w:val="left"/>
       </w:pPr>
       <w:r>
-        <w:t xml:space="preserve">One folder. One master list. Every family member involved in the care has it: the cards, the doctors, every diagnosis, and the medication list — updated the day anything changes, with which doctor prescribes each drug, and brand and generic names side by side. The full checklist is in this chapter.</w:t>
+        <w:t xml:space="preserve">One folder. One master list. Every family member involved in the care has it: the cards, the doctors, every diagnosis, and the medication list, updated the day anything changes, with which doctor prescribes each drug, and brand and generic names side by side. The full checklist is in this chapter.</w:t>
       </w:r>
     </w:p>
     <w:p>
@@ -1426,7 +1426,7 @@
         <w:jc w:val="left"/>
       </w:pPr>
       <w:r>
-        <w:t xml:space="preserve">A friend of mine learned this with their own mother. Her dementia had been progressing for a while — and when the family finally reached for the paperwork, the window had closed. A person has to be capable of understanding what they are signing, and she no longer was. She could not put her own choice on paper anymore. She could not name which of her children spoke for her, or make sure the hospital would listen to the right one without a fight.</w:t>
+        <w:t xml:space="preserve">A friend of mine learned this with their own mother. Her dementia had been progressing for a while. When the family finally reached for the paperwork, the window had closed. A person has to be capable of understanding what they are signing, and she no longer was. She could not put her own choice on paper anymore. She could not name which of her children spoke for her, or make sure the hospital would listen to the right one without a fight.</w:t>
       </w:r>
     </w:p>
     <w:p>
@@ -1456,17 +1456,17 @@
         <w:jc w:val="left"/>
       </w:pPr>
       <w:r>
-        <w:t xml:space="preserve">And here is the other half, because you may be reading this with a diagnosis already in the family: a diagnosis is not the closed window. Many people in early dementia can still legally sign — the question is whether they understand what the document does, and an elder-law attorney can tell you in one visit. Go this week.</w:t>
-      </w:r>
-    </w:p>
-    <w:p>
-      <w:pPr>
-        <w:spacing w:line="480"/>
-        <w:ind w:firstLine="720"/>
-        <w:jc w:val="left"/>
-      </w:pPr>
-      <w:r>
-        <w:t xml:space="preserve">And if the window truly has closed in your family, keep reading. There is still a path — this chapter covers it — and missing a window nobody showed you is not the same as failing.</w:t>
+        <w:t xml:space="preserve">And here is the other half, because you may be reading this with a diagnosis already in the family: a diagnosis is not the closed window. Many people in early dementia can still legally sign. The question is whether they understand what the document does, and an elder-law attorney can tell you in one visit. Go this week.</w:t>
+      </w:r>
+    </w:p>
+    <w:p>
+      <w:pPr>
+        <w:spacing w:line="480"/>
+        <w:ind w:firstLine="720"/>
+        <w:jc w:val="left"/>
+      </w:pPr>
+      <w:r>
+        <w:t xml:space="preserve">And if the window truly has closed in your family, keep reading. There is still a path, and this chapter covers it. Missing a window nobody showed you is not the same as failing.</w:t>
       </w:r>
     </w:p>
     <w:p>
@@ -1551,7 +1551,7 @@
         <w:jc w:val="left"/>
       </w:pPr>
       <w:r>
-        <w:t xml:space="preserve">I have seen this fight, and I want you to understand something about it: both sides love the same person. Both sides believe they are defending that person's wishes. And both sides are guessing — because nothing was ever written down.</w:t>
+        <w:t xml:space="preserve">I have seen this fight, and I want you to understand something about it: both sides love the same person. Both sides believe they are defending that person's wishes. And both sides are guessing, because nothing was ever written down.</w:t>
       </w:r>
     </w:p>
     <w:p>
@@ -1571,7 +1571,7 @@
         <w:t xml:space="preserve">what do we think they'd want</w:t>
       </w:r>
       <w:r>
-        <w:t xml:space="preserve"> — with everyone's grief and fear and history piled onto the answer — and becomes </w:t>
+        <w:t xml:space="preserve">, with everyone's grief and fear and history piled onto the answer, and becomes </w:t>
       </w:r>
       <w:r>
         <w:rPr>
@@ -1611,7 +1611,7 @@
         <w:t xml:space="preserve">findable</w:t>
       </w:r>
       <w:r>
-        <w:t xml:space="preserve">. A DNR that exists in a drawer nobody can locate does not exist — if the paper cannot be produced, the default is full intervention, including the things your person said they never wanted. Chapter 23 covers where these orders must physically live. For now: write it down, and make sure the right people can put their hands on it in under a minute.</w:t>
+        <w:t xml:space="preserve">. A DNR that exists in a drawer nobody can locate does not exist. If the paper cannot be produced, the default is full intervention, including the things your person said they never wanted. Chapter 23 covers where these orders must physically live. For now: write it down, and make sure the right people can put their hands on it in under a minute.</w:t>
       </w:r>
     </w:p>
     <w:p>
@@ -1669,7 +1669,7 @@
         <w:jc w:val="left"/>
       </w:pPr>
       <w:r>
-        <w:t xml:space="preserve">The rent at the assisted living community. The insurance premium that keeps coverage alive. The bills that keep the lights on in a house nobody's living in right now. Without a financial power of attorney — or with the wrong person named — the family can't act, and a court and a judge step in. Guardianship proceedings, oversight, months of it. The court usually ends up appointing a family member anyway — after the delay, the cost, and the strangers added to your family's worst month. And while all of that grinds forward, everything waits. So does the person it's all for.</w:t>
+        <w:t xml:space="preserve">The rent at the assisted living community. The insurance premium that keeps coverage alive. The bills that keep the lights on in a house nobody's living in right now. Without a financial power of attorney, or with the wrong person named, the family can't act, and a court and a judge step in. Guardianship proceedings, oversight, months of it. The court usually ends up appointing a family member anyway, after the delay, the cost, and the strangers added to your family's worst month. And while all of that grinds forward, everything waits. So does the person it's all for.</w:t>
       </w:r>
     </w:p>
     <w:p>
@@ -1689,7 +1689,7 @@
         <w:jc w:val="left"/>
       </w:pPr>
       <w:r>
-        <w:t xml:space="preserve">So here is what I want you to do. Get all three documents done together — the living will, the healthcare power of attorney, the financial power of attorney. One effort, one afternoon if you can manage it. Do it with someone who knows your state's rules, because signing requirements vary — witnesses, notaries, and who is allowed to be which.</w:t>
+        <w:t xml:space="preserve">So here is what I want you to do. Get all three documents done together: the living will, the healthcare power of attorney, the financial power of attorney. One effort, one afternoon if you can manage it. Do it with someone who knows your state's rules, because signing requirements vary: witnesses, notaries, and who is allowed to be which.</w:t>
       </w:r>
     </w:p>
     <w:p>
@@ -1764,7 +1764,7 @@
         <w:jc w:val="left"/>
       </w:pPr>
       <w:r>
-        <w:t xml:space="preserve">Just last week, I sat with a family and helped them have the conversation — the one about what's coming, what he wants, what needs saying while there's still time to say it. I have that conversation with other families all the time. Don't leave anything left unsaid.</w:t>
+        <w:t xml:space="preserve">Just last week, I sat with a family and helped them have the conversation: the one about what's coming, what he wants, what needs saying while there's still time to say it. I have that conversation with other families all the time. Don't leave anything left unsaid.</w:t>
       </w:r>
     </w:p>
     <w:p>
@@ -1784,7 +1784,7 @@
         <w:jc w:val="left"/>
       </w:pPr>
       <w:r>
-        <w:t xml:space="preserve">I never forced the planning conversations. I knew better — it is literally my work — and I still let them slide, the way every family does. There was always going to be more time. So the decisions he should have made stayed unmade, and they came due the week of his funeral. Money questions, surfacing in the worst week to face them.</w:t>
+        <w:t xml:space="preserve">I never forced the planning conversations. I knew better (it is literally my work) and I still let them slide, the way every family does. There was always going to be more time. So the decisions he should have made stayed unmade, and they came due the week of his funeral. Money questions, surfacing in the worst week to face them.</w:t>
       </w:r>
     </w:p>
     <w:p>
@@ -1804,27 +1804,27 @@
         <w:jc w:val="left"/>
       </w:pPr>
       <w:r>
-        <w:t xml:space="preserve">But there is a second kind of unsaid — and that kind, I finished. I said everything to my father while he could still answer me back. I was not in the room when he died; that story belongs to Chapter 27. What I can tell you here is that the words I had already said are what let me survive it.</w:t>
-      </w:r>
-    </w:p>
-    <w:p>
-      <w:pPr>
-        <w:spacing w:line="480"/>
-        <w:ind w:firstLine="720"/>
-        <w:jc w:val="left"/>
-      </w:pPr>
-      <w:r>
-        <w:t xml:space="preserve">So don't save the practical conversations for the end. The last days are too late for the practical conversations — and never too late for the loving ones. If the last days are where you are right now, go to Chapter 28, and keep talking to them. For everything else, the right time is now, at a kitchen table, while the person you love can still answer you back.</w:t>
-      </w:r>
-    </w:p>
-    <w:p>
-      <w:pPr>
-        <w:spacing w:line="480"/>
-        <w:ind w:firstLine="720"/>
-        <w:jc w:val="left"/>
-      </w:pPr>
-      <w:r>
-        <w:t xml:space="preserve">Two conversations, then. The practical one — wishes, decisions, money, orders — which this chapter walks you through, question by question. And the love one, which only you can script.</w:t>
+        <w:t xml:space="preserve">But there is a second kind of unsaid, and that kind, I finished. I said everything to my father while he could still answer me back. I was not in the room when he died. That story belongs to Chapter 27. What I can tell you here is that the words I had already said are what let me survive it.</w:t>
+      </w:r>
+    </w:p>
+    <w:p>
+      <w:pPr>
+        <w:spacing w:line="480"/>
+        <w:ind w:firstLine="720"/>
+        <w:jc w:val="left"/>
+      </w:pPr>
+      <w:r>
+        <w:t xml:space="preserve">So don't save the practical conversations for the end. The last days are too late for the practical conversations, and never too late for the loving ones. If the last days are where you are right now, go to Chapter 28, and keep talking to them. For everything else, the right time is now, at a kitchen table, while the person you love can still answer you back.</w:t>
+      </w:r>
+    </w:p>
+    <w:p>
+      <w:pPr>
+        <w:spacing w:line="480"/>
+        <w:ind w:firstLine="720"/>
+        <w:jc w:val="left"/>
+      </w:pPr>
+      <w:r>
+        <w:t xml:space="preserve">Two conversations, then. The practical one (wishes, decisions, money, orders), which this chapter walks you through, question by question. And the love one, which only you can script.</w:t>
       </w:r>
     </w:p>
     <w:p>
@@ -1882,7 +1882,7 @@
         <w:jc w:val="left"/>
       </w:pPr>
       <w:r>
-        <w:t xml:space="preserve">My dad spent his last week at Baptist Hospital. The family gathered — my brothers and sister, my stepmom at his side.</w:t>
+        <w:t xml:space="preserve">My dad spent his last week at Baptist Hospital. The family gathered: my brothers and sister, my stepmom at his side.</w:t>
       </w:r>
     </w:p>
     <w:p>
@@ -1902,7 +1902,7 @@
         <w:jc w:val="left"/>
       </w:pPr>
       <w:r>
-        <w:t xml:space="preserve">That same week, my mom — who has Parkinson's disease — had made the trip to Raleigh to visit me. Watching her, I understood something nobody said out loud: this was probably the last trip she would ever be able to take. So I stayed. I did the math that every child of two declining parents eventually does. Dad would hold on a couple more days. I would honor Mom's last visit, then go to him.</w:t>
+        <w:t xml:space="preserve">That same week, my mom, who has Parkinson's disease, had made the trip to Raleigh to visit me. Watching her, I understood something nobody said out loud: this was probably the last trip she would ever be able to take. So I stayed. I did the math that every child of two declining parents eventually does. Dad would hold on a couple more days. I would honor Mom's last visit, then go to him.</w:t>
       </w:r>
     </w:p>
     <w:p>
@@ -1952,7 +1952,7 @@
         <w:jc w:val="left"/>
       </w:pPr>
       <w:r>
-        <w:t xml:space="preserve">Here is the part I need to be honest about, because it is the reason this book has the title it has. At first, I did not feel guilty. I had made a real choice between two parents who needed me. I had said everything to my father long before that week — no forgiveness withheld, nothing I was still saving up to say. And the last memory I have of my dad is not tubes and machines. It is </w:t>
+        <w:t xml:space="preserve">Here is the part I need to be honest about, because it is the reason this book has the title it has. At first, I did not feel guilty. I had made a real choice between two parents who needed me. I had said everything to my father long before that week: no forgiveness withheld, nothing I was still saving up to say. And the last memory I have of my dad is not tubes and machines. It is </w:t>
       </w:r>
       <w:r>
         <w:rPr>
@@ -1992,7 +1992,7 @@
         <w:jc w:val="left"/>
       </w:pPr>
       <w:r>
-        <w:t xml:space="preserve">So I want to say something to whoever needs it: sometimes "it's your fault" is not even your own sentence. Someone hands it to you — grieving, angry, in the worst week of their lives — and you carry it as if it were yours. You are allowed to put it down. Grief turns loving people into scorekeepers. There was never a score.</w:t>
+        <w:t xml:space="preserve">So I want to say something to whoever needs it: sometimes "it's your fault" is not even your own sentence. Someone hands it to you, grieving, angry, in the worst week of their lives, and you carry it as if it were yours. You are allowed to put it down. Grief turns loving people into scorekeepers. There was never a score.</w:t>
       </w:r>
     </w:p>
     <w:p>
@@ -2022,7 +2022,7 @@
         <w:jc w:val="left"/>
       </w:pPr>
       <w:r>
-        <w:t xml:space="preserve">A last-days plan is not about controlling death. Death does not take instructions. A plan is about deciding, before the last week, what matters most: who needs to be there, who calls whom, what he would want in the room, and what you will do when it happens faster than anyone believed. Not so the plan goes perfectly — so that whatever happens, you know you did what could be done. The rest was never yours to carry.</w:t>
+        <w:t xml:space="preserve">A last-days plan is not about controlling death. Death does not take instructions. A plan is about deciding, before the last week, what matters most: who needs to be there, who calls whom, what he would want in the room, and what you will do when it happens faster than anyone believed. Not so the plan goes perfectly. So that whatever happens, you know you did what could be done. The rest was never yours to carry.</w:t>
       </w:r>
     </w:p>
     <w:p>
@@ -2090,27 +2090,27 @@
         <w:jc w:val="left"/>
       </w:pPr>
       <w:r>
-        <w:t xml:space="preserve">Nobody tells families what dying looks like. So every change looks like an emergency. Every sound seems like suffering. Every hour, someone wants to call 911. The fear in the room doesn't come from what is happening — it comes from not knowing that what is happening is normal.</w:t>
-      </w:r>
-    </w:p>
-    <w:p>
-      <w:pPr>
-        <w:spacing w:line="480"/>
-        <w:ind w:firstLine="720"/>
-        <w:jc w:val="left"/>
-      </w:pPr>
-      <w:r>
-        <w:t xml:space="preserve">So let me tell you what I have watched at hundreds of bedsides, and what the hospice nurses and doctors taught me standing next to them — so that you can walk in prepared.</w:t>
-      </w:r>
-    </w:p>
-    <w:p>
-      <w:pPr>
-        <w:spacing w:line="480"/>
-        <w:ind w:firstLine="720"/>
-        <w:jc w:val="left"/>
-      </w:pPr>
-      <w:r>
-        <w:t xml:space="preserve">They will sleep more. Then more than that. Eating and drinking will fade — and this is where families struggle hardest, because food is how we love people. You will want to coax one more bite. Hear me: near the end, the body is finished with food. It is not starving. It is shutting down the systems it no longer needs, and forcing food and fluids doesn't add days — it adds discomfort. Offering is still allowed: sips and tastes for pleasure, mouth care for comfort. Offer. Never force.</w:t>
+        <w:t xml:space="preserve">Nobody tells families what dying looks like. So every change looks like an emergency. Every sound seems like suffering. Every hour, someone wants to call 911. The fear in the room doesn't come from what is happening. It comes from not knowing that what is happening is normal.</w:t>
+      </w:r>
+    </w:p>
+    <w:p>
+      <w:pPr>
+        <w:spacing w:line="480"/>
+        <w:ind w:firstLine="720"/>
+        <w:jc w:val="left"/>
+      </w:pPr>
+      <w:r>
+        <w:t xml:space="preserve">So let me tell you what I have watched at hundreds of bedsides, and what the hospice nurses and doctors taught me standing next to them, so that you can walk in prepared.</w:t>
+      </w:r>
+    </w:p>
+    <w:p>
+      <w:pPr>
+        <w:spacing w:line="480"/>
+        <w:ind w:firstLine="720"/>
+        <w:jc w:val="left"/>
+      </w:pPr>
+      <w:r>
+        <w:t xml:space="preserve">They will sleep more. Then more than that. Eating and drinking will fade. This is where families struggle hardest, because food is how we love people. You will want to coax one more bite. Hear me: near the end, the body is finished with food. It is not starving. It is shutting down the systems it no longer needs, and forcing food and fluids doesn't add days. It adds discomfort. Offering is still allowed: sips and tastes for pleasure, mouth care for comfort. Offer. Never force.</w:t>
       </w:r>
     </w:p>
     <w:p>
@@ -2130,27 +2130,27 @@
         <w:jc w:val="left"/>
       </w:pPr>
       <w:r>
-        <w:t xml:space="preserve">There may be restlessness. And there may be visions — reaching for things you cannot see, conversations with people who died years ago. I have stopped trying to explain this. I only know that it happens, that it is common, and that the dying are usually not frightened by it. More often, they seem comforted. You already know what to do, because it's the same thing I taught you in the dementia chapter: don't argue with their reality. Join it. But restlessness that looks like distress is different — that one you report. The team can treat it.</w:t>
-      </w:r>
-    </w:p>
-    <w:p>
-      <w:pPr>
-        <w:spacing w:line="480"/>
-        <w:ind w:firstLine="720"/>
-        <w:jc w:val="left"/>
-      </w:pPr>
-      <w:r>
-        <w:t xml:space="preserve">Then there is the rally. One day — often near the very end — they may wake up clear. Alert, talking, maybe hungry, asking for people. Families take it as a turnaround. I have watched it break hearts twice for that reason. The rally is real, but it is usually not a recovery. It is a gift. Treat it like one: gather, say everything, laugh if there's laughing to do. It is often the last good day.</w:t>
-      </w:r>
-    </w:p>
-    <w:p>
-      <w:pPr>
-        <w:spacing w:line="480"/>
-        <w:ind w:firstLine="720"/>
-        <w:jc w:val="left"/>
-      </w:pPr>
-      <w:r>
-        <w:t xml:space="preserve">And through all of it — this most of all — </w:t>
+        <w:t xml:space="preserve">There may be restlessness. And there may be visions: reaching for things you cannot see, conversations with people who died years ago. I have stopped trying to explain this. I only know that it happens, that it is common, and that the dying are usually not frightened by it. More often, they seem comforted. You already know what to do, because it's the same thing I taught you in the dementia chapter: don't argue with their reality. Join it. But restlessness that looks like distress is different. That one you report. The team can treat it.</w:t>
+      </w:r>
+    </w:p>
+    <w:p>
+      <w:pPr>
+        <w:spacing w:line="480"/>
+        <w:ind w:firstLine="720"/>
+        <w:jc w:val="left"/>
+      </w:pPr>
+      <w:r>
+        <w:t xml:space="preserve">Then there is the rally. One day, often near the very end, they may wake up clear. Alert, talking, maybe hungry, asking for people. Families take it as a turnaround. I have watched it break hearts twice for that reason. The rally is real, but it is usually not a recovery. It is a gift. Treat it like one: gather, say everything, laugh if there's laughing to do. It is often the last good day.</w:t>
+      </w:r>
+    </w:p>
+    <w:p>
+      <w:pPr>
+        <w:spacing w:line="480"/>
+        <w:ind w:firstLine="720"/>
+        <w:jc w:val="left"/>
+      </w:pPr>
+      <w:r>
+        <w:t xml:space="preserve">And through all of it, this most of all: </w:t>
       </w:r>
       <w:r>
         <w:rPr>
@@ -2170,7 +2170,7 @@
         <w:jc w:val="left"/>
       </w:pPr>
       <w:r>
-        <w:t xml:space="preserve">One more thing about the fear of the phone. When hospice is on board and death is expected, the number to call is the hospice line, not 911. It answers twenty-four hours a day, and it exists for exactly these hours — for any change, and for any fear, at 2 a.m. as much as 2 p.m.</w:t>
+        <w:t xml:space="preserve">One more thing about the fear of the phone. When hospice is on board and death is expected, the number to call is the hospice line, not 911. It answers twenty-four hours a day, and it exists for exactly these hours: for any change, and for any fear, at 2 a.m. as much as 2 p.m.</w:t>
       </w:r>
     </w:p>
     <w:p>
@@ -2278,27 +2278,27 @@
         <w:jc w:val="left"/>
       </w:pPr>
       <w:r>
-        <w:t xml:space="preserve">So the money questions came due during funeral week — the one week that exists for grieving — and they pulled us away from the only thing that week was for.</w:t>
-      </w:r>
-    </w:p>
-    <w:p>
-      <w:pPr>
-        <w:spacing w:line="480"/>
-        <w:ind w:firstLine="720"/>
-        <w:jc w:val="left"/>
-      </w:pPr>
-      <w:r>
-        <w:t xml:space="preserve">I told you in Chapter 5 about the meeting my family never had. I'm telling you now what it cost. There are two plans, and most families have at most one of them. The wishes plan: what they want, where, how. The financial plan: what it costs and where the money comes from. My family had the first. Nobody had the second. Grief and a checkbook do not belong in the same week — and the only way to keep them apart is to make both plans while everyone is still alive.</w:t>
-      </w:r>
-    </w:p>
-    <w:p>
-      <w:pPr>
-        <w:spacing w:line="480"/>
-        <w:ind w:firstLine="720"/>
-        <w:jc w:val="left"/>
-      </w:pPr>
-      <w:r>
-        <w:t xml:space="preserve">The rest of this chapter walks you through those first days — the calls, the funeral home, the practical tasks that arrive whether you are ready or not — and the weeks after, which nobody talks about at all. Take everything slowly. There is no stopwatch on any of it.</w:t>
+        <w:t xml:space="preserve">So the money questions came due during funeral week, the one week that exists for grieving, and they pulled us away from the only thing that week was for.</w:t>
+      </w:r>
+    </w:p>
+    <w:p>
+      <w:pPr>
+        <w:spacing w:line="480"/>
+        <w:ind w:firstLine="720"/>
+        <w:jc w:val="left"/>
+      </w:pPr>
+      <w:r>
+        <w:t xml:space="preserve">I told you in Chapter 5 about the meeting my family never had. I'm telling you now what it cost. There are two plans, and most families have at most one of them. The wishes plan: what they want, where, how. The financial plan: what it costs and where the money comes from. My family had the first. Nobody had the second. Grief and a checkbook do not belong in the same week. The only way to keep them apart is to make both plans while everyone is still alive.</w:t>
+      </w:r>
+    </w:p>
+    <w:p>
+      <w:pPr>
+        <w:spacing w:line="480"/>
+        <w:ind w:firstLine="720"/>
+        <w:jc w:val="left"/>
+      </w:pPr>
+      <w:r>
+        <w:t xml:space="preserve">The rest of this chapter walks you through those first days (the calls, the funeral home, the practical tasks that arrive whether you are ready or not) and the weeks after, which nobody talks about at all. Take everything slowly. There is no stopwatch on any of it.</w:t>
       </w:r>
     </w:p>
     <w:p>
@@ -2338,7 +2338,7 @@
         <w:jc w:val="left"/>
       </w:pPr>
       <w:r>
-        <w:t xml:space="preserve">That is the last thing this book has to say to you. The love does not end on the day they die. It keeps arriving — in the tasks you finish for them, in the words you said while they could still hear you, in whatever lands on the branch outside your window when you need it most.</w:t>
+        <w:t xml:space="preserve">That is the last thing this book has to say to you. The love does not end on the day they die. It keeps arriving: in the tasks you finish for them, in the words you said while they could still hear you, in whatever lands on the branch outside your window when you need it most.</w:t>
       </w:r>
     </w:p>
     <w:p>

</xml_diff>